<commit_message>
Add Hydrus feature videos
</commit_message>
<xml_diff>
--- a/Meeting.docx
+++ b/Meeting.docx
@@ -204,115 +204,95 @@
         <w:rPr>
           <w:highlight w:val="green"/>
         </w:rPr>
-        <w:t xml:space="preserve">Any product images and videos? I saw them on the advanced navigation’s </w:t>
-      </w:r>
-      <w:proofErr w:type="gramStart"/>
+        <w:t>Any product images and videos? I saw them on the advanced navigation’s website, I also need the content that we will add.</w:t>
+      </w:r>
+    </w:p>
+    <w:p>
+      <w:r>
+        <w:rPr>
+          <w:highlight w:val="yellow"/>
+        </w:rPr>
+        <w:t>About us, now it is a placeholder, I need the content</w:t>
+      </w:r>
+      <w:r>
+        <w:rPr>
+          <w:highlight w:val="yellow"/>
+        </w:rPr>
+        <w:t>. Russ to provide content, remove our team section.</w:t>
+      </w:r>
+    </w:p>
+    <w:p>
+      <w:pPr>
+        <w:rPr>
+          <w:b/>
+          <w:bCs/>
+        </w:rPr>
+      </w:pPr>
+      <w:r>
+        <w:rPr>
+          <w:b/>
+          <w:bCs/>
+        </w:rPr>
+        <w:t>5. Functionality</w:t>
+      </w:r>
+    </w:p>
+    <w:p>
+      <w:r>
+        <w:rPr>
+          <w:highlight w:val="yellow"/>
+        </w:rPr>
+        <w:t>Contact form, where do the requests go?</w:t>
+      </w:r>
+      <w:r>
+        <w:rPr>
+          <w:highlight w:val="yellow"/>
+        </w:rPr>
+        <w:t xml:space="preserve"> Add WhatsApp as a contact option (Russ to check the domain and hosting from the domain provider, might have a professional email included).</w:t>
+      </w:r>
+      <w:r>
+        <w:t xml:space="preserve"> </w:t>
+      </w:r>
       <w:r>
         <w:rPr>
           <w:highlight w:val="green"/>
         </w:rPr>
-        <w:t>website,</w:t>
-      </w:r>
-      <w:proofErr w:type="gramEnd"/>
+        <w:t>Add a mandatory phone number field</w:t>
+      </w:r>
+    </w:p>
+    <w:p>
       <w:r>
         <w:rPr>
           <w:highlight w:val="green"/>
         </w:rPr>
-        <w:t xml:space="preserve"> I also need the content that we will add.</w:t>
-      </w:r>
-    </w:p>
-    <w:p>
-      <w:r>
-        <w:rPr>
-          <w:highlight w:val="yellow"/>
-        </w:rPr>
-        <w:t>About us, now it is a placeholder, I need the content</w:t>
-      </w:r>
-      <w:r>
-        <w:rPr>
-          <w:highlight w:val="yellow"/>
-        </w:rPr>
-        <w:t>. Russ to provide content, remove our team section.</w:t>
-      </w:r>
-    </w:p>
-    <w:p>
-      <w:pPr>
-        <w:rPr>
-          <w:b/>
-          <w:bCs/>
-        </w:rPr>
-      </w:pPr>
-      <w:r>
-        <w:rPr>
-          <w:b/>
-          <w:bCs/>
-        </w:rPr>
-        <w:t>5. Functionality</w:t>
-      </w:r>
-    </w:p>
-    <w:p>
-      <w:r>
-        <w:rPr>
-          <w:highlight w:val="yellow"/>
-        </w:rPr>
-        <w:t>Contact form, where do the requests go?</w:t>
-      </w:r>
-      <w:r>
-        <w:rPr>
-          <w:highlight w:val="yellow"/>
-        </w:rPr>
-        <w:t xml:space="preserve"> Add WhatsApp as a contact option (Russ to check the domain and hosting from the domain provider, might have a professional email included).</w:t>
-      </w:r>
-      <w:r>
-        <w:t xml:space="preserve"> </w:t>
-      </w:r>
+        <w:t xml:space="preserve">Will add cookies bar once complete to comply with </w:t>
+      </w:r>
+      <w:proofErr w:type="spellStart"/>
       <w:r>
         <w:rPr>
           <w:highlight w:val="green"/>
         </w:rPr>
-        <w:t>Add a mandatory phone number field</w:t>
-      </w:r>
-    </w:p>
-    <w:p>
+        <w:t>gdpr</w:t>
+      </w:r>
+      <w:proofErr w:type="spellEnd"/>
       <w:r>
         <w:rPr>
           <w:highlight w:val="green"/>
         </w:rPr>
-        <w:t xml:space="preserve">Will add cookies bar once complete to comply with </w:t>
-      </w:r>
-      <w:proofErr w:type="spellStart"/>
+        <w:t>.</w:t>
+      </w:r>
+    </w:p>
+    <w:p>
       <w:r>
         <w:rPr>
           <w:highlight w:val="green"/>
         </w:rPr>
-        <w:t>gdpr</w:t>
-      </w:r>
-      <w:proofErr w:type="spellEnd"/>
+        <w:t>Domain name: DNS access</w:t>
+      </w:r>
       <w:r>
         <w:rPr>
           <w:highlight w:val="green"/>
         </w:rPr>
-        <w:t>.</w:t>
-      </w:r>
-    </w:p>
-    <w:p>
-      <w:r>
-        <w:rPr>
-          <w:highlight w:val="green"/>
-        </w:rPr>
-        <w:t>Domain name: DNS access</w:t>
-      </w:r>
-      <w:r>
-        <w:rPr>
-          <w:highlight w:val="green"/>
-        </w:rPr>
-        <w:t xml:space="preserve"> </w:t>
-      </w:r>
-      <w:r>
-        <w:rPr>
-          <w:highlight w:val="green"/>
-        </w:rPr>
-        <w:t>http://advancednavigation.sk/</w:t>
+        <w:t xml:space="preserve"> http://advancednavigation.sk/</w:t>
       </w:r>
     </w:p>
     <w:p>
@@ -388,6 +368,181 @@
         </w:rPr>
         <w:t>Get images and videos from the main websites</w:t>
       </w:r>
+    </w:p>
+    <w:p>
+      <w:pPr>
+        <w:rPr>
+          <w:lang w:val="en-US"/>
+        </w:rPr>
+      </w:pPr>
+      <w:r>
+        <w:rPr>
+          <w:lang w:val="en-US"/>
+        </w:rPr>
+        <w:t>Fix the contact us section and add the map. Add a section that says authorized in Hungary Austria, Czech republic and Slovakia .</w:t>
+      </w:r>
+    </w:p>
+    <w:p>
+      <w:pPr>
+        <w:rPr>
+          <w:lang w:val="en-US"/>
+        </w:rPr>
+      </w:pPr>
+    </w:p>
+    <w:p>
+      <w:pPr>
+        <w:rPr>
+          <w:lang w:val="en-US"/>
+        </w:rPr>
+      </w:pPr>
+      <w:r>
+        <w:rPr>
+          <w:lang w:val="en-US"/>
+        </w:rPr>
+        <w:br w:type="page"/>
+      </w:r>
+    </w:p>
+    <w:p>
+      <w:pPr>
+        <w:rPr>
+          <w:b/>
+          <w:bCs/>
+          <w:lang w:val="en-US"/>
+        </w:rPr>
+      </w:pPr>
+      <w:r>
+        <w:rPr>
+          <w:b/>
+          <w:bCs/>
+          <w:lang w:val="en-US"/>
+        </w:rPr>
+        <w:lastRenderedPageBreak/>
+        <w:t>Email login details:</w:t>
+      </w:r>
+    </w:p>
+    <w:p>
+      <w:pPr>
+        <w:rPr>
+          <w:lang w:val="en-US"/>
+        </w:rPr>
+      </w:pPr>
+      <w:hyperlink r:id="rId4" w:history="1">
+        <w:r>
+          <w:rPr>
+            <w:rStyle w:val="Hyperlink"/>
+            <w:lang w:val="en-US"/>
+          </w:rPr>
+          <w:t>info@advancednavigation.sk</w:t>
+        </w:r>
+      </w:hyperlink>
+    </w:p>
+    <w:p>
+      <w:pPr>
+        <w:rPr>
+          <w:lang w:val="en-US"/>
+        </w:rPr>
+      </w:pPr>
+      <w:r>
+        <w:rPr>
+          <w:lang w:val="en-US"/>
+        </w:rPr>
+        <w:t xml:space="preserve">Pass: </w:t>
+      </w:r>
+      <w:r>
+        <w:rPr>
+          <w:lang w:val="en-US"/>
+        </w:rPr>
+        <w:t>iRLjZRU4Lb!CVaZ</w:t>
+      </w:r>
+    </w:p>
+    <w:p>
+      <w:pPr>
+        <w:rPr>
+          <w:b/>
+          <w:bCs/>
+          <w:lang w:val="en-US"/>
+        </w:rPr>
+      </w:pPr>
+      <w:r>
+        <w:rPr>
+          <w:b/>
+          <w:bCs/>
+          <w:lang w:val="en-US"/>
+        </w:rPr>
+        <w:t>Resend login details:</w:t>
+      </w:r>
+    </w:p>
+    <w:p>
+      <w:pPr>
+        <w:rPr>
+          <w:lang w:val="en-US"/>
+        </w:rPr>
+      </w:pPr>
+      <w:hyperlink r:id="rId5" w:history="1">
+        <w:r>
+          <w:rPr>
+            <w:rStyle w:val="Hyperlink"/>
+            <w:lang w:val="en-US"/>
+          </w:rPr>
+          <w:t>info@advancednavigation.sk</w:t>
+        </w:r>
+      </w:hyperlink>
+    </w:p>
+    <w:p>
+      <w:pPr>
+        <w:rPr>
+          <w:lang w:val="en-US"/>
+        </w:rPr>
+      </w:pPr>
+      <w:r>
+        <w:rPr>
+          <w:lang w:val="en-US"/>
+        </w:rPr>
+        <w:t xml:space="preserve">Pass: </w:t>
+      </w:r>
+      <w:r>
+        <w:rPr>
+          <w:lang w:val="en-US"/>
+        </w:rPr>
+        <w:t>?C_d$tm%J&amp;r2732</w:t>
+      </w:r>
+    </w:p>
+    <w:p>
+      <w:pPr>
+        <w:rPr>
+          <w:b/>
+          <w:bCs/>
+          <w:lang w:val="en-US"/>
+        </w:rPr>
+      </w:pPr>
+      <w:r>
+        <w:rPr>
+          <w:b/>
+          <w:bCs/>
+          <w:lang w:val="en-US"/>
+        </w:rPr>
+        <w:t>Resend API:</w:t>
+      </w:r>
+    </w:p>
+    <w:p>
+      <w:pPr>
+        <w:rPr>
+          <w:lang w:val="en-US"/>
+        </w:rPr>
+      </w:pPr>
+      <w:r>
+        <w:rPr>
+          <w:lang w:val="en-US"/>
+        </w:rPr>
+        <w:t>re_dxd2xa6w_GWErtrfJ6eLfxp2FbfMu1o4U</w:t>
+      </w:r>
+    </w:p>
+    <w:p>
+      <w:pPr>
+        <w:rPr>
+          <w:lang w:val="en-US"/>
+        </w:rPr>
+      </w:pPr>
     </w:p>
     <w:sectPr>
       <w:pgSz w:w="11906" w:h="16838"/>
@@ -1316,6 +1471,29 @@
       <w:spacing w:val="5"/>
     </w:rPr>
   </w:style>
+  <w:style w:type="character" w:styleId="Hyperlink">
+    <w:name w:val="Hyperlink"/>
+    <w:basedOn w:val="DefaultParagraphFont"/>
+    <w:uiPriority w:val="99"/>
+    <w:unhideWhenUsed/>
+    <w:rsid w:val="004E4685"/>
+    <w:rPr>
+      <w:color w:val="467886" w:themeColor="hyperlink"/>
+      <w:u w:val="single"/>
+    </w:rPr>
+  </w:style>
+  <w:style w:type="character" w:styleId="UnresolvedMention">
+    <w:name w:val="Unresolved Mention"/>
+    <w:basedOn w:val="DefaultParagraphFont"/>
+    <w:uiPriority w:val="99"/>
+    <w:semiHidden/>
+    <w:unhideWhenUsed/>
+    <w:rsid w:val="004E4685"/>
+    <w:rPr>
+      <w:color w:val="605E5C"/>
+      <w:shd w:val="clear" w:color="auto" w:fill="E1DFDD"/>
+    </w:rPr>
+  </w:style>
 </w:styles>
 </file>
 

</xml_diff>